<commit_message>
Reword the four new documents in plain report style; note in README
Co-Authored-By: Claude Sonnet 5.5 <noreply@anthropic.com>
</commit_message>
<xml_diff>
--- a/SERS_Sepsis_Spectral_Library/08_Methodology/07_LTA_Reacquisition_Recording_Checklist.docx
+++ b/SERS_Sepsis_Spectral_Library/08_Methodology/07_LTA_Reacquisition_Recording_Checklist.docx
@@ -16,29 +16,15 @@
         <w:t>Companion to: 06_Lab_Data_Recording_SOP_NAM_LTA_LPS.docx and 06_Raman_Data_Recording_Template.xlsx. Project: SERS Sepsis bulk-powder Raman library. Operator: Sukesh Periyasamy (IIT Jodhpur).</w:t>
       </w:r>
     </w:p>
-    <w:tbl>
-      <w:tblPr>
-        <w:tblStyle w:val="TableGrid"/>
-        <w:tblW w:type="auto" w:w="0"/>
-        <w:tblLook w:firstColumn="1" w:firstRow="1" w:lastColumn="0" w:lastRow="0" w:noHBand="0" w:noVBand="1" w:val="04A0"/>
-      </w:tblPr>
-      <w:tblGrid>
-        <w:gridCol w:w="10318"/>
-      </w:tblGrid>
-      <w:tr>
-        <w:tc>
-          <w:tcPr>
-            <w:tcW w:type="dxa" w:w="10318"/>
-            <w:shd w:val="clear" w:color="auto" w:fill="EAF2FB"/>
-          </w:tcPr>
-          <w:p>
-            <w:r>
-              <w:t>RULES. Substrate is always a glass slide. Laser power is recorded in % of maximum (never converted to mW). If something is not recorded, write "Not recorded"; never guess. Never delete or overwrite an original raw file; failed spectra are kept and logged. Use "tentative", "consistent with", "suggests" in notes.</w:t>
-            </w:r>
-          </w:p>
-        </w:tc>
-      </w:tr>
-    </w:tbl>
+    <w:p>
+      <w:r>
+        <w:rPr>
+          <w:b w:val="0"/>
+          <w:i w:val="0"/>
+        </w:rPr>
+        <w:t>Reminders for the session: measure every spot on a glass slide, note the laser power as a percentage of the maximum, and write "Not recorded" for anything that was not noted. Keep every original raw file, including spectra that failed, and log the reason.</w:t>
+      </w:r>
+    </w:p>
     <w:p/>
     <w:p>
       <w:pPr>

</xml_diff>